<commit_message>
vault backup: 2026-10-19 20:22:32
</commit_message>
<xml_diff>
--- a/ПРЕДМЕТЫ/Автоматизированные производственные системы/Эссе/Эссе 3/Поповкин. Эссе 3.docx
+++ b/ПРЕДМЕТЫ/Автоматизированные производственные системы/Эссе/Эссе 3/Поповкин. Эссе 3.docx
@@ -332,7 +332,7 @@
               <w:bCs/>
               <w:szCs w:val="28"/>
             </w:rPr>
-            <w:t>2</w:t>
+            <w:t>3</w:t>
           </w:r>
         </w:p>
         <w:p>
@@ -374,7 +374,7 @@
             <w:rPr>
               <w:szCs w:val="28"/>
             </w:rPr>
-            <w:t>Типы автоматизированных производств и автоматизированных производственных систем</w:t>
+            <w:t>Управление автоматизированными производствами</w:t>
           </w:r>
           <w:r>
             <w:rPr>
@@ -621,6 +621,20 @@
           <w:pPr>
             <w:spacing w:line="240" w:lineRule="auto"/>
             <w:ind w:firstLine="0"/>
+            <w:jc w:val="center"/>
+          </w:pPr>
+        </w:p>
+        <w:p>
+          <w:pPr>
+            <w:spacing w:line="240" w:lineRule="auto"/>
+            <w:ind w:firstLine="0"/>
+            <w:jc w:val="center"/>
+          </w:pPr>
+        </w:p>
+        <w:p>
+          <w:pPr>
+            <w:spacing w:line="240" w:lineRule="auto"/>
+            <w:ind w:firstLine="0"/>
           </w:pPr>
         </w:p>
         <w:p>
@@ -746,19 +760,13 @@
     </w:p>
     <w:p>
       <w:r>
-        <w:t>АСУ ТП (автоматизированная система управления технологическим процессом) — комплекс программных и технических средств, обеспечивающий автоматический сбор данных, регулирование и управление параметрами производственного процесса в реальном времени</w:t>
-      </w:r>
-      <w:r>
-        <w:t>.</w:t>
+        <w:t>АСУ ТП (автоматизированная система управления технологическим процессом) — комплекс программных и технических средств, обеспечивающий автоматический сбор данных, регулирование и управление параметрами производственного процесса в реальном времени.</w:t>
       </w:r>
     </w:p>
     <w:p>
       <w:r>
         <w:lastRenderedPageBreak/>
-        <w:t>ПЛК (программируемый логический контроллер) — специализированный промышленный компьютер, предназначенный для реализации алгоритмов логического и аналогового управления технологическим оборудованием в реальном времени</w:t>
-      </w:r>
-      <w:r>
-        <w:t>.</w:t>
+        <w:t>ПЛК (программируемый логический контроллер) — специализированный промышленный компьютер, предназначенный для реализации алгоритмов логического и аналогового управления технологическим оборудованием в реальном времени.</w:t>
       </w:r>
     </w:p>
     <w:p>
@@ -779,50 +787,32 @@
       </w:r>
       <w:proofErr w:type="spellEnd"/>
       <w:r>
-        <w:t>) — программно-аппаратный комплекс диспетчерского уровня, обеспечивающий визуализацию технологического процесса, оперативное управление, архивирование данных и аварийную сигнализацию</w:t>
-      </w:r>
-      <w:r>
-        <w:t>.</w:t>
-      </w:r>
-    </w:p>
-    <w:p>
-      <w:r>
-        <w:t>Технологический регламент — нормативный документ, определяющий порядок ведения технологического процесса, допустимые диапазоны параметров и действия персонала в штатных и нештатных ситуациях</w:t>
-      </w:r>
-      <w:r>
-        <w:t>.</w:t>
-      </w:r>
-    </w:p>
-    <w:p>
-      <w:r>
-        <w:t>Реальное время (в АСУ ТП) — режим функционирования системы, при котором время обработки входных данных и формирования управляющих воздействий не превышает заданного предельного значения, определяемого динамикой объекта управления</w:t>
-      </w:r>
-      <w:r>
-        <w:t>.</w:t>
-      </w:r>
-    </w:p>
-    <w:p>
-      <w:r>
-        <w:t>Противоаварийная защита — совокупность технических и программных средств АСУ ТП, автоматически переводящих объект в безопасное состояние при выходе параметров за допустимые пределы</w:t>
-      </w:r>
-      <w:r>
-        <w:t>.</w:t>
-      </w:r>
-    </w:p>
-    <w:p>
-      <w:r>
-        <w:t>Цифровой двойник — Виртуальная модель технологического объекта или процесса, синхронизированная с физическим объектом в реальном времени и используемая для мониторинга, прогнозирования и оптимизации</w:t>
-      </w:r>
-      <w:r>
-        <w:t>.</w:t>
-      </w:r>
-    </w:p>
-    <w:p>
-      <w:r>
-        <w:t>Распределённая система управления (DCS) — архитектура АСУ ТП, в которой функции управления распределены между территориально разнесёнными контроллерами, объединёнными промышленной сетью</w:t>
-      </w:r>
-      <w:r>
-        <w:t>.</w:t>
+        <w:t>) — программно-аппаратный комплекс диспетчерского уровня, обеспечивающий визуализацию технологического процесса, оперативное управление, архивирование данных и аварийную сигнализацию.</w:t>
+      </w:r>
+    </w:p>
+    <w:p>
+      <w:r>
+        <w:t>Технологический регламент — нормативный документ, определяющий порядок ведения технологического процесса, допустимые диапазоны параметров и действия персонала в штатных и нештатных ситуациях.</w:t>
+      </w:r>
+    </w:p>
+    <w:p>
+      <w:r>
+        <w:t>Реальное время (в АСУ ТП) — режим функционирования системы, при котором время обработки входных данных и формирования управляющих воздействий не превышает заданного предельного значения, определяемого динамикой объекта управления.</w:t>
+      </w:r>
+    </w:p>
+    <w:p>
+      <w:r>
+        <w:t>Противоаварийная защита — совокупность технических и программных средств АСУ ТП, автоматически переводящих объект в безопасное состояние при выходе параметров за допустимые пределы.</w:t>
+      </w:r>
+    </w:p>
+    <w:p>
+      <w:r>
+        <w:t>Цифровой двойник — Виртуальная модель технологического объекта или процесса, синхронизированная с физическим объектом в реальном времени и используемая для мониторинга, прогнозирования и оптимизации.</w:t>
+      </w:r>
+    </w:p>
+    <w:p>
+      <w:r>
+        <w:t>Распределённая система управления (DCS) — архитектура АСУ ТП, в которой функции управления распределены между территориально разнесёнными контроллерами, объединёнными промышленной сетью.</w:t>
       </w:r>
     </w:p>
     <w:p>
@@ -833,48 +823,27 @@
     <w:p>
       <w:r>
         <w:lastRenderedPageBreak/>
-        <w:t>Модуль КИС — функционально завершённый компонент корпоративной системы, реализующий определённый класс задач (финансы, логистика, производство) и использующий общую базу данных</w:t>
-      </w:r>
-      <w:r>
-        <w:t>.</w:t>
-      </w:r>
-    </w:p>
-    <w:p>
-      <w:r>
-        <w:t>ERP-система (Enterprise Resource Planning) — класс КИС, обеспечивающий комплексное планирование и управление всеми ресурсами предприятия на основе единой модели данных и бизнес-процессов</w:t>
-      </w:r>
-      <w:r>
-        <w:t>.</w:t>
-      </w:r>
-    </w:p>
-    <w:p>
-      <w:r>
-        <w:t>Реинжиниринг бизнес-процессов — фундаментальное переосмысление и радикальное перепроектирование управленческих и производственных процедур предприятия</w:t>
-      </w:r>
-      <w:r>
-        <w:t xml:space="preserve"> дл</w:t>
-      </w:r>
-      <w:r>
-        <w:t>я достижения качественного улучшения ключевых показателей</w:t>
-      </w:r>
-      <w:r>
-        <w:t>.</w:t>
-      </w:r>
-    </w:p>
-    <w:p>
-      <w:r>
-        <w:t>Единое информационное пространство — состояние информационной инфраструктуры предприятия, при котором данные вводятся однократно, хранятся в согласованном виде и доступны всем авторизованным пользователям без ручного переноса</w:t>
-      </w:r>
-      <w:r>
-        <w:t>.</w:t>
-      </w:r>
-    </w:p>
-    <w:p>
-      <w:r>
-        <w:t>Сквозной информационный поток — последовательность передачи данных между функциональными подсистемами КИС без промежуточного ручного ввода и трансформации форматов</w:t>
-      </w:r>
-      <w:r>
-        <w:t>.</w:t>
+        <w:t>Модуль КИС — функционально завершённый компонент корпоративной системы, реализующий определённый класс задач (финансы, логистика, производство) и использующий общую базу данных.</w:t>
+      </w:r>
+    </w:p>
+    <w:p>
+      <w:r>
+        <w:t>ERP-система (Enterprise Resource Planning) — класс КИС, обеспечивающий комплексное планирование и управление всеми ресурсами предприятия на основе единой модели данных и бизнес-процессов.</w:t>
+      </w:r>
+    </w:p>
+    <w:p>
+      <w:r>
+        <w:t>Реинжиниринг бизнес-процессов — фундаментальное переосмысление и радикальное перепроектирование управленческих и производственных процедур предприятия для достижения качественного улучшения ключевых показателей.</w:t>
+      </w:r>
+    </w:p>
+    <w:p>
+      <w:r>
+        <w:t>Единое информационное пространство — состояние информационной инфраструктуры предприятия, при котором данные вводятся однократно, хранятся в согласованном виде и доступны всем авторизованным пользователям без ручного переноса.</w:t>
+      </w:r>
+    </w:p>
+    <w:p>
+      <w:r>
+        <w:t>Сквозной информационный поток — последовательность передачи данных между функциональными подсистемами КИС без промежуточного ручного ввода и трансформации форматов.</w:t>
       </w:r>
     </w:p>
     <w:p>
@@ -887,10 +856,7 @@
       </w:r>
       <w:proofErr w:type="spellEnd"/>
       <w:r>
-        <w:t xml:space="preserve"> Management) — подсистема КИС, обеспечивающая управление взаимоотношениями с клиентами, фиксацию истории взаимодействий и анализ эффективности продаж</w:t>
-      </w:r>
-      <w:r>
-        <w:t>.</w:t>
+        <w:t xml:space="preserve"> Management) — подсистема КИС, обеспечивающая управление взаимоотношениями с клиентами, фиксацию истории взаимодействий и анализ эффективности продаж.</w:t>
       </w:r>
     </w:p>
     <w:p>
@@ -903,10 +869,7 @@
       </w:r>
       <w:proofErr w:type="spellEnd"/>
       <w:r>
-        <w:t>) — модель предоставления программного обеспечения, при которой КИС размещается на удалённых серверах провайдера и предоставляется предприятию по подписке через сеть Интернет</w:t>
-      </w:r>
-      <w:r>
-        <w:t>.</w:t>
+        <w:t>) — модель предоставления программного обеспечения, при которой КИС размещается на удалённых серверах провайдера и предоставляется предприятию по подписке через сеть Интернет.</w:t>
       </w:r>
     </w:p>
     <w:p>
@@ -992,10 +955,7 @@
       </w:r>
       <w:r>
         <w:lastRenderedPageBreak/>
-        <w:t>программного продукта, а предварительная формализация управленческих процедур и готовность организации к изменению устоявшихся практик. Техническая реализация вторична по отношению к организационному проектированию.</w:t>
-      </w:r>
-      <w:r>
-        <w:t xml:space="preserve"> </w:t>
+        <w:t xml:space="preserve">программного продукта, а предварительная формализация управленческих процедур и готовность организации к изменению устоявшихся практик. Техническая реализация вторична по отношению к организационному проектированию. </w:t>
       </w:r>
     </w:p>
     <w:p>
@@ -1096,10 +1056,7 @@
         <w:t xml:space="preserve">Подводя итог, </w:t>
       </w:r>
       <w:r>
-        <w:t>АСУ ТП является тем звеном автоматизации, где цена ошибки наиболее высока — от качества проектирования и надёжности функционирования зависят не только экономические показатели, но и безопасность персонала и окружающей среды. Поэтому при построении АСУ ТП приоритет всегда отдаётся надёжности и детерминизму, а не гибкости и скорости внедрения.</w:t>
-      </w:r>
-      <w:r>
-        <w:t xml:space="preserve"> </w:t>
+        <w:t xml:space="preserve">АСУ ТП является тем звеном автоматизации, где цена ошибки наиболее высока — от качества проектирования и надёжности функционирования зависят не только экономические показатели, но и безопасность персонала и окружающей среды. Поэтому при построении АСУ ТП приоритет всегда отдаётся надёжности и детерминизму, а не гибкости и скорости внедрения. </w:t>
       </w:r>
     </w:p>
     <w:p>
@@ -1198,10 +1155,7 @@
         <w:t>В результате видим следующий вывод. К</w:t>
       </w:r>
       <w:r>
-        <w:t>орпоративная информационная система является не самоцелью, а инструментом реализации стратегии предприятия. Успешность КИС определяется не количеством внедрённых модулей и не стоимостью лицензий, а тем, насколько сократилось время принятия решений, снизилась доля ошибок и повысилась прозрачность управления. Внедрение КИС без предварительной оптимизации бизнес-процессов и без активной роли первого руководителя обречено на формальный результат.</w:t>
-      </w:r>
-      <w:r>
-        <w:t xml:space="preserve"> </w:t>
+        <w:t xml:space="preserve">орпоративная информационная система является не самоцелью, а инструментом реализации стратегии предприятия. Успешность КИС определяется не количеством внедрённых модулей и не стоимостью лицензий, а тем, насколько сократилось время принятия решений, снизилась доля ошибок и повысилась прозрачность управления. Внедрение КИС без предварительной оптимизации бизнес-процессов и без активной роли первого руководителя обречено на формальный результат. </w:t>
       </w:r>
     </w:p>
     <w:p>

</xml_diff>

<commit_message>
vault backup: 2026-10-19 20:57:09
</commit_message>
<xml_diff>
--- a/ПРЕДМЕТЫ/Автоматизированные производственные системы/Эссе/Эссе 3/Поповкин. Эссе 3.docx
+++ b/ПРЕДМЕТЫ/Автоматизированные производственные системы/Эссе/Эссе 3/Поповкин. Эссе 3.docx
@@ -672,490 +672,208 @@
       </w:r>
     </w:p>
     <w:p>
-      <w:r>
-        <w:t>Организационно-экономическая система управления — автоматизированная система, обеспечивающая поддержку планирования, учёта, контроля и анализа хозяйственной деятельности предприятия на административном уровне</w:t>
-      </w:r>
-      <w:r>
+      <w:pPr>
+        <w:pStyle w:val="1"/>
+        <w:ind w:firstLine="0"/>
+      </w:pPr>
+      <w:r>
+        <w:br w:type="column"/>
+      </w:r>
+      <w:r>
+        <w:lastRenderedPageBreak/>
+        <w:t xml:space="preserve">1. </w:t>
+      </w:r>
+      <w:r>
+        <w:t>Современное предприятие как объект управления.</w:t>
+      </w:r>
+    </w:p>
+    <w:p>
+      <w:r>
+        <w:t>Современное промышленное предприятие представляет собой сложную организационно-техническую систему, в которой материальные, информационные, финансовые и кадровые потоки преобразуются в продукцию или услугу, обладающую рыночной ценностью. Как объект управления предприятие обладает рядом свойств, определяющих специфику и сложность управленческих задач [6].</w:t>
+      </w:r>
+    </w:p>
+    <w:p>
+      <w:r>
+        <w:t xml:space="preserve">Системная природа предприятия. Предприятие характеризуется структурой — устойчивой совокупностью элементов (подразделений, технологических участков, служб) и связей между ними. </w:t>
+      </w:r>
+      <w:r>
+        <w:t>В</w:t>
+      </w:r>
+      <w:r>
+        <w:t xml:space="preserve"> организации </w:t>
+      </w:r>
+      <w:r>
+        <w:t xml:space="preserve">выделяются </w:t>
+      </w:r>
+      <w:r>
+        <w:t>прямые связи (управляющие воздействия от субъекта к объекту) и обратные связи (информация о результатах исполнения, возвращающаяся к лицу, принявшему решение) [6]. Именно наличие контуров обратной связи принципиально отличает управляемую систему от простого набора ресурсов: без обратной связи управление вырождается в однократное воздействие без возможности коррекции.</w:t>
+      </w:r>
+    </w:p>
+    <w:p>
+      <w:r>
+        <w:t>Открытость и взаимодействие со средой. Предприятие является открытой системой, непрерывно обменивающейся с внешней средой ресурсами, информацией и продукцией. Входы системы — сырьё, материалы, энергия, рабочая сила, инвестиции, нормативные требования; выходы — готовая продукция, отходы, финансовые результаты, информация для акционеров и регуляторов. Изменчивость внешней среды — колебания спроса, действия конкурентов, технологические сдвиги, изменения законодательства — делает управление предприятием по сути задачей адаптации к непрерывно меняющимся условиям [6].</w:t>
+      </w:r>
+    </w:p>
+    <w:p>
+      <w:r>
+        <w:t xml:space="preserve">Многокритериальность и иерархичность целей. В отличие от технических систем с единственной целевой функцией, предприятие одновременно преследует множество целей: максимизация прибыли, обеспечение качества продукции, выполнение обязательств перед заказчиками, развитие персонала, </w:t>
+      </w:r>
+      <w:r>
+        <w:lastRenderedPageBreak/>
+        <w:t>минимизация экологического воздействия. Эти цели могут противоречить друг другу, что требует от системы управления механизмов согласования и компромисса [1]. Иерархичность проявляется в том, что стратегические цели декомпозируются в тактические, а те — в оперативные задания конкретным исполнителям.</w:t>
+      </w:r>
+    </w:p>
+    <w:p>
+      <w:r>
+        <w:t>Динамичность и жизненный цикл. Предприятие не является статичным объектом: оно проходит стадии создания, становления, роста, зрелости и трансформации или упадка. На каждой стадии изменяются приоритеты управления, организационная структура, требования к информационным системам. Ю. В. Псигин подчёркивает, что управление производственной системой должно учитывать не только текущее состояние, но и траекторию развития, закладывая в управленческие решения элемент прогнозирования [8].</w:t>
+      </w:r>
+    </w:p>
+    <w:p>
+      <w:r>
+        <w:t>Информационная насыщенность. В современном производстве доля информационного компонента в стоимости продукции неуклонно растёт. Управление предприятием сегодня — это в значительной мере управление данными: их сбором, верификацией, интерпретацией и превращением в решения. Е. И. Яблочников и соавторы обращают внимание на то, что информационные технологии пронизывают весь жизненный цикл изделия — от концепции и проектирования до производства, эксплуатации и утилизации, — и управление предприятием невозможно без сквозной цифровой нити, связывающей все этапы [9].</w:t>
+      </w:r>
+    </w:p>
+    <w:p>
+      <w:pPr>
         <w:rPr>
           <w:b/>
         </w:rPr>
-        <w:t>.</w:t>
-      </w:r>
-    </w:p>
-    <w:p>
-      <w:r>
-        <w:t>Поддержка принятия решений — функция информационной системы, заключающаяся в предоставлении лицу, принимающему решение, структурированных данных, аналитических моделей и вариантов действий для обоснованного выбора</w:t>
-      </w:r>
-      <w:r>
+      </w:pPr>
+      <w:r>
+        <w:t>Таким образом, современное предприятие как объект управления характеризуется системностью, открытостью, многокритериальностью, динамичностью и информационной насыщенностью. Ни одно из этих свойств не может быть проигнорировано при проектировании управленческих механизмов. Авторская позиция: адекватное управление предприятием возможно лишь при условии, что управленческая система отражает сложность управляемого объекта — упрощение модели предприятия неизбежно ведёт к потере управляемости и принятию неэффективных решений.</w:t>
+      </w:r>
+    </w:p>
+    <w:p>
+      <w:pPr>
+        <w:pStyle w:val="1"/>
+      </w:pPr>
+      <w:r>
+        <w:lastRenderedPageBreak/>
+        <w:t xml:space="preserve">2. </w:t>
+      </w:r>
+      <w:r>
+        <w:t>Автоматизированные системы управления предприятием (АСУП)</w:t>
+      </w:r>
+    </w:p>
+    <w:p>
+      <w:r>
+        <w:t>Автоматизированная система управления предприятием (АСУП) представляет собой комплекс программных, технических, информационных, организационных и кадровых средств, предназначенный для автоматизации управленческих функций на уровне предприятия как хозяйствующего субъекта. В отличие от АСУ ТП, воздействующей непосредственно на технологические параметры, АСУП оперирует экономическими, плановыми и организационными данными и обеспечивает принятие решений руководителями различных уровней [4].</w:t>
+      </w:r>
+    </w:p>
+    <w:p>
+      <w:r>
+        <w:t>Место АСУП в иерархии управления производством. В классической модели автоматизированного производства выделяются три основных уровня. Нижний уровень составляют АСУ ТП, управляющие оборудованием и технологическими процессами в реальном времени. Средний уровень занимают системы оперативного управления производством (MES — Manufacturing Execution System), обеспечивающие диспетчирование, учёт выработки и контроль исполнения сменных заданий. Верхний уровень представляет АСУП, решающая задачи стратегического и тактического планирования, финансового управления, управления персоналом и взаимодействия с контрагентами [2]. АСУП получает от нижних уровней агрегированные данные о фактическом ходе производства и передаёт вниз плановые задания, нормативы и управляющие параметры.</w:t>
+      </w:r>
+    </w:p>
+    <w:p>
+      <w:r>
+        <w:t>Функциональная структура АСУП. В. В. Баронов и соавторы выделяют в составе АСУП типовые функциональные подсистемы: планирование производства и материально-технического снабжения; управление финансами и экономический анализ; управление персоналом и расчёт заработной платы; управление сбытом и взаимоотношениями с клиентами; бухгалтерский учёт и отчётность; управление качеством; управление проектами и инвестициями [1]. Каждая подсистема реализует замкнутый цикл «план — исполнение — учёт — анализ — корректировка», при этом данные циркулируют между подсистемами без повторного ввода.</w:t>
+      </w:r>
+    </w:p>
+    <w:p>
+      <w:r>
+        <w:lastRenderedPageBreak/>
+        <w:t>Информационное обеспечение АСУП. Основу АСУП составляет единая база данных предприятия, включающая справочники (номенклатура, контрагенты, организационная структура), нормативно-плановую информацию (маршрутные карты, спецификации, плановые калькуляции), оперативные данные (заказы, остатки, транзакции) и архивную информацию для аналитики. И. Д. Рудинский подчёркивает, что качество информационного обеспечения является определяющим фактором эффективности АСУП: система, оперирующая неточными или несвоевременными данными, генерирует некорректные управленческие решения, что может быть опаснее отсутствия системы вообще [4].</w:t>
+      </w:r>
+    </w:p>
+    <w:p>
+      <w:r>
+        <w:t>Эволюция АСУП. Исторически АСУП развивались от локальных расчётных задач 1960–1970-х годов (бухгалтерский учёт, расчёт зарплат) через отраслевые автоматизированные системы управления (ОАСУ) к современным ERP-системам. Принципиальным сдвигом стал переход от пакетной обработки данных к оперативному режиму, от функциональной разобщённости к интеграции и от жёстко заданных алгоритмов к настраиваемым бизнес-процессам [1]. Современные АСУП реализуются преимущественно в виде ERP-платформ (SAP, 1С, Oracle, Галактика), дополняемых специализированными модулями и аналитическими надстройками.</w:t>
+      </w:r>
+    </w:p>
+    <w:p>
+      <w:r>
+        <w:t>Организационные аспекты. Внедрение АСУП неизбежно влечёт изменение организационной структуры, перераспределение функций и перестройку документооборота. Как отмечает Рудинский, технология проектирования АСУП должна включать не только разработку программного и технического обеспечения, но и проектирование организационного обеспечения: новых должностных инструкций, регламентов взаимодействия подразделений, процедур принятия решений [4]. Без этой составляющей даже технически безупречная система не будет эффективно использоваться.</w:t>
+      </w:r>
+    </w:p>
+    <w:p>
+      <w:pPr>
         <w:rPr>
           <w:b/>
         </w:rPr>
-        <w:t>.</w:t>
-      </w:r>
-    </w:p>
-    <w:p>
-      <w:r>
-        <w:t>Документооборот — процесс создания, передачи, согласования, хранения и уничтожения документов в организации, автоматизация которого является одной из задач административных систем управления</w:t>
-      </w:r>
-      <w:r>
-        <w:rPr>
-          <w:b/>
-        </w:rPr>
-        <w:t>.</w:t>
-      </w:r>
-    </w:p>
-    <w:p>
-      <w:r>
-        <w:t>Бюджетирование — процесс формирования, исполнения и контроля финансовых планов (бюджетов) предприятия по подразделениям, проектам и периодам</w:t>
-      </w:r>
-      <w:r>
-        <w:rPr>
-          <w:b/>
-        </w:rPr>
-        <w:t>.</w:t>
-      </w:r>
-    </w:p>
-    <w:p>
-      <w:pPr>
-        <w:rPr>
-          <w:b/>
-        </w:rPr>
-      </w:pPr>
-      <w:r>
-        <w:t>Слабоструктурированная задача — управленческая задача, для которой невозможно полностью формализовать критерии, ограничения и алгоритм решения, что требует участия человека в контуре принятия решений</w:t>
-      </w:r>
-      <w:r>
-        <w:rPr>
-          <w:b/>
-        </w:rPr>
-        <w:t>.</w:t>
-      </w:r>
-    </w:p>
-    <w:p>
-      <w:r>
-        <w:t>Информационное обеспечение управления — совокупность данных, методов их сбора, обработки и представления, необходимых для реализации функций управления на всех уровнях организации</w:t>
-      </w:r>
-      <w:r>
-        <w:rPr>
-          <w:b/>
-        </w:rPr>
-        <w:t>.</w:t>
-      </w:r>
-    </w:p>
-    <w:p>
-      <w:pPr>
-        <w:rPr>
-          <w:b/>
-        </w:rPr>
-      </w:pPr>
-      <w:r>
-        <w:t>Административный регламент — формализованное описание последовательности действий, полномочий и ответственности при выполнении управленческой процедуры</w:t>
-      </w:r>
-      <w:r>
-        <w:rPr>
-          <w:b/>
-        </w:rPr>
-        <w:t>.</w:t>
-      </w:r>
-    </w:p>
-    <w:p>
-      <w:r>
-        <w:t>АСУ ТП (автоматизированная система управления технологическим процессом) — комплекс программных и технических средств, обеспечивающий автоматический сбор данных, регулирование и управление параметрами производственного процесса в реальном времени.</w:t>
-      </w:r>
-    </w:p>
-    <w:p>
+      </w:pPr>
+      <w:r>
+        <w:t xml:space="preserve">Авторская позиция: АСУП является не просто программным продуктом, а организационно-техническим проектом, успех которого определяется в первую очередь ясностью управленческих целей и готовностью организации к </w:t>
+      </w:r>
       <w:r>
         <w:lastRenderedPageBreak/>
-        <w:t>ПЛК (программируемый логический контроллер) — специализированный промышленный компьютер, предназначенный для реализации алгоритмов логического и аналогового управления технологическим оборудованием в реальном времени.</w:t>
-      </w:r>
-    </w:p>
-    <w:p>
-      <w:r>
-        <w:t>SCADA (</w:t>
+        <w:t>изменениям. Техническая архитектура вторична по отношению к качеству управленческих процессов, которые система должна обслуживать.</w:t>
+      </w:r>
+      <w:r>
+        <w:t xml:space="preserve"> </w:t>
+      </w:r>
+    </w:p>
+    <w:p>
+      <w:pPr>
+        <w:pStyle w:val="1"/>
+      </w:pPr>
+      <w:r>
+        <w:t xml:space="preserve">3. </w:t>
+      </w:r>
+      <w:r>
+        <w:t>Общая характеристика автоматизированных систем управления технологическими процессами (АСУТП)</w:t>
+      </w:r>
+    </w:p>
+    <w:p>
+      <w:r>
+        <w:t>Автоматизированная система управления технологическими процессами (АСУ ТП) — это класс автоматизированных систем, непосредственно взаимодействующих с физическим объектом управления и обеспечивающих поддержание технологических параметров в заданных пределах, реализацию управляющих алгоритмов и защиту оборудования в нештатных ситуациях. АСУ ТП является нижним, наиболее «физическим» уровнем в иерархии автоматизации производства и отличается от АСУП прежде всего тем, что работает с аналоговыми и дискретными сигналами в реальном времени, а не с документами и экономическими показателями [2].</w:t>
+      </w:r>
+    </w:p>
+    <w:p>
+      <w:r>
+        <w:t>Объект управления. Объектом АСУ ТП выступает технологический процесс или установка: химический реактор, металлургическая печь, конвейерная линия, энергетический котёл, станок с числовым программным управлением. Каждый объект характеризуется набором входных и выходных переменных (температура, давление, расход, уровень, скорость, усилие), допустимыми диапазонами их изменения и динамическими свойствами (инерционностью, нелинейностью, наличием запаздывания) [2]. Понимание физики объекта является отправной точкой проектирования АСУ ТП.</w:t>
+      </w:r>
+    </w:p>
+    <w:p>
+      <w:r>
+        <w:t xml:space="preserve">Основные функции АСУ ТП. Ю. Н. Фёдоров выделяет следующий типовой состав функций [2]: непрерывный сбор и первичная обработка данных с датчиков; автоматическое регулирование параметров по заданным уставкам; логическое и программное управление последовательностями технологических операций; противоаварийная защита и технологические блокировки; оперативное отображение информации оператору (визуализация); архивирование данных и формирование отчётов; дистанционное управление </w:t>
+      </w:r>
+      <w:r>
+        <w:lastRenderedPageBreak/>
+        <w:t>исполнительными механизмами; передача данных на верхний уровень управления (в MES и АСУП).</w:t>
+      </w:r>
+    </w:p>
+    <w:p>
+      <w:r>
+        <w:t>Уровневая архитектура. Современная АСУ ТП строится по многоуровневому принципу. Полевой уровень включает датчики, преобразователи сигналов, исполнительные механизмы (задвижки, приводы, нагреватели). Контроллерный уровень представлен программируемыми логическими контроллерами (ПЛК), промышленными компьютерами и специализированными регуляторами, реализующими алгоритмы управления с периодом от миллисекунд до секунд. Диспетчерский (операторский) уровень обеспечивается SCADA-системами, предоставляющими средства визуализации, аварийной сигнализации и ручного вмешательства. Верхний уровень обеспечивает связь АСУ ТП с системами управления производством и предприятием [2].</w:t>
+      </w:r>
+    </w:p>
+    <w:p>
+      <w:r>
+        <w:t>Требования к АСУ ТП. Специфика непосредственного воздействия на физическое оборудование предъявляет к АСУ ТП особые требования, нехарактерные для организационно-экономических систем. Это детерминизм времени отклика — управляющее воздействие должно быть сформировано не позднее заданного предельного времени; высокая надёжность и отказоустойчивость, достигаемая резервированием каналов связи, контроллеров и источников питания; устойчивость к промышленным деструктивным факторам (вибрация, температура, электромагнитные помехи); безопасность, обеспечиваемая независимыми системами противоаварийной защиты [2]. Нарушение этих требований может привести не только к экономическим потерям, но и к авариям с человеческими жертвами.</w:t>
+      </w:r>
+    </w:p>
+    <w:p>
+      <w:r>
+        <w:t xml:space="preserve">Классификация АСУ ТП. По характеру объекта управления выделяют системы управления непрерывными процессами (энергетика, химия, нефтепереработка), где параметры изменяются плавно и описываются дифференциальными уравнениями; системы управления дискретными процессами (сборочные линии, упаковка, станки), где управление сводится к логическим последовательностям; и гибридные системы, сочетающие </w:t>
+      </w:r>
+      <w:r>
+        <w:lastRenderedPageBreak/>
+        <w:t>непрерывные и дискретные участки [8]. По степени автоматизации различают автоматические системы (человек исключён из контура регулирования) и автоматизированные системы (человек-оператор участвует в принятии решений на верхнем уровне) [4].</w:t>
+      </w:r>
+    </w:p>
+    <w:p>
+      <w:r>
+        <w:t xml:space="preserve">Тенденции развития. Современные АСУ ТП эволюционируют в направлении распределённых архитектур, промышленных сетевых протоколов (PROFINET, </w:t>
       </w:r>
       <w:proofErr w:type="spellStart"/>
       <w:r>
-        <w:t>Supervisory</w:t>
+        <w:t>EtherCAT</w:t>
       </w:r>
       <w:proofErr w:type="spellEnd"/>
       <w:r>
-        <w:t xml:space="preserve"> Control And Data </w:t>
-      </w:r>
-      <w:proofErr w:type="spellStart"/>
-      <w:r>
-        <w:t>Acquisition</w:t>
-      </w:r>
-      <w:proofErr w:type="spellEnd"/>
-      <w:r>
-        <w:t>) — программно-аппаратный комплекс диспетчерского уровня, обеспечивающий визуализацию технологического процесса, оперативное управление, архивирование данных и аварийную сигнализацию.</w:t>
-      </w:r>
-    </w:p>
-    <w:p>
-      <w:r>
-        <w:t>Технологический регламент — нормативный документ, определяющий порядок ведения технологического процесса, допустимые диапазоны параметров и действия персонала в штатных и нештатных ситуациях.</w:t>
-      </w:r>
-    </w:p>
-    <w:p>
-      <w:r>
-        <w:t>Реальное время (в АСУ ТП) — режим функционирования системы, при котором время обработки входных данных и формирования управляющих воздействий не превышает заданного предельного значения, определяемого динамикой объекта управления.</w:t>
-      </w:r>
-    </w:p>
-    <w:p>
-      <w:r>
-        <w:t>Противоаварийная защита — совокупность технических и программных средств АСУ ТП, автоматически переводящих объект в безопасное состояние при выходе параметров за допустимые пределы.</w:t>
-      </w:r>
-    </w:p>
-    <w:p>
-      <w:r>
-        <w:t>Цифровой двойник — Виртуальная модель технологического объекта или процесса, синхронизированная с физическим объектом в реальном времени и используемая для мониторинга, прогнозирования и оптимизации.</w:t>
-      </w:r>
-    </w:p>
-    <w:p>
-      <w:r>
-        <w:t>Распределённая система управления (DCS) — архитектура АСУ ТП, в которой функции управления распределены между территориально разнесёнными контроллерами, объединёнными промышленной сетью.</w:t>
-      </w:r>
-    </w:p>
-    <w:p>
-      <w:r>
-        <w:t>Корпоративная информационная система (КИС) — интегрированный комплекс программных, аппаратных и организационных средств, автоматизирующий управленческую и производственную деятельность предприятия в едином информационном пространстве</w:t>
-      </w:r>
-    </w:p>
-    <w:p>
-      <w:r>
-        <w:lastRenderedPageBreak/>
-        <w:t>Модуль КИС — функционально завершённый компонент корпоративной системы, реализующий определённый класс задач (финансы, логистика, производство) и использующий общую базу данных.</w:t>
-      </w:r>
-    </w:p>
-    <w:p>
-      <w:r>
-        <w:t>ERP-система (Enterprise Resource Planning) — класс КИС, обеспечивающий комплексное планирование и управление всеми ресурсами предприятия на основе единой модели данных и бизнес-процессов.</w:t>
-      </w:r>
-    </w:p>
-    <w:p>
-      <w:r>
-        <w:t>Реинжиниринг бизнес-процессов — фундаментальное переосмысление и радикальное перепроектирование управленческих и производственных процедур предприятия для достижения качественного улучшения ключевых показателей.</w:t>
-      </w:r>
-    </w:p>
-    <w:p>
-      <w:r>
-        <w:t>Единое информационное пространство — состояние информационной инфраструктуры предприятия, при котором данные вводятся однократно, хранятся в согласованном виде и доступны всем авторизованным пользователям без ручного переноса.</w:t>
-      </w:r>
-    </w:p>
-    <w:p>
-      <w:r>
-        <w:t>Сквозной информационный поток — последовательность передачи данных между функциональными подсистемами КИС без промежуточного ручного ввода и трансформации форматов.</w:t>
-      </w:r>
-    </w:p>
-    <w:p>
-      <w:r>
-        <w:t xml:space="preserve">CRM (Customer </w:t>
-      </w:r>
-      <w:proofErr w:type="spellStart"/>
-      <w:r>
-        <w:t>Relationship</w:t>
-      </w:r>
-      <w:proofErr w:type="spellEnd"/>
-      <w:r>
-        <w:t xml:space="preserve"> Management) — подсистема КИС, обеспечивающая управление взаимоотношениями с клиентами, фиксацию истории взаимодействий и анализ эффективности продаж.</w:t>
-      </w:r>
-    </w:p>
-    <w:p>
-      <w:r>
-        <w:t>Облачная архитектура (</w:t>
-      </w:r>
-      <w:proofErr w:type="spellStart"/>
-      <w:r>
-        <w:t>SaaS</w:t>
-      </w:r>
-      <w:proofErr w:type="spellEnd"/>
-      <w:r>
-        <w:t>) — модель предоставления программного обеспечения, при которой КИС размещается на удалённых серверах провайдера и предоставляется предприятию по подписке через сеть Интернет.</w:t>
-      </w:r>
-    </w:p>
-    <w:p>
-      <w:pPr>
-        <w:pStyle w:val="1"/>
-      </w:pPr>
-      <w:r>
-        <w:br w:type="column"/>
-      </w:r>
-      <w:r>
-        <w:lastRenderedPageBreak/>
-        <w:t xml:space="preserve">1. </w:t>
-      </w:r>
-      <w:r>
-        <w:t>Системы организационно-экономического или административного управления</w:t>
-      </w:r>
-    </w:p>
-    <w:p>
-      <w:r>
-        <w:t>Системы организационно-экономического (административного) управления представляют собой класс автоматизированных систем, обеспечивающих поддержку управленческих решений на уровне предприятия как хозяйствующего субъекта. В отличие от систем, непосредственно воздействующих на технологическое оборудование, данные системы оперируют преимущественно документальной, финансовой и организационной информацией, а их объектом управления выступают не физические параметры процесса, а экономические показатели, кадровые ресурсы и административные процедуры [1].</w:t>
-      </w:r>
-    </w:p>
-    <w:p>
-      <w:r>
-        <w:t>Функциональное назначение систем организационно-экономического управления охватывает несколько крупных блоков. Во-первых, это планирование: формирование стратегических, тактических и оперативных планов деятельности предприятия, бюджетирование, составление графиков работ. Во-вторых, учёт и отчётность: ведение бухгалтерского и налогового учёта, статистической отчётности, кадрового делопроизводства. В-третьих, контроль и анализ: мониторинг исполнения плановых показателей, выявление отклонений, формирование аналитических отчётов для руководства. В-четвёртых, документооборот и коммуникация: автоматизация прохождения документов, согласований, приказов и распоряжений [5].</w:t>
-      </w:r>
-    </w:p>
-    <w:p>
-      <w:r>
-        <w:t xml:space="preserve">Структурно системы данного типа, как правило, включают подсистему обработки данных (базы данных, хранилища информации), подсистему формирования отчётных форм, подсистему поддержки принятия решений (модели прогнозирования, оптимизации, имитации) и подсистему документационного обеспечения. По степени автоматизации выделяют системы справочно-информационного обслуживания (предоставляют данные для принятия решения человеком), системы поддержки принятия решений </w:t>
-      </w:r>
-      <w:r>
-        <w:lastRenderedPageBreak/>
-        <w:t>(предлагают варианты решений) и системы автоматического принятия решений для рутинных, хорошо формализуемых задач [4].</w:t>
-      </w:r>
-    </w:p>
-    <w:p>
-      <w:r>
-        <w:t xml:space="preserve">Исторически системы организационно-экономического управления развивались от простых расчётных задач (начисление заработной платы, учёт материалов) к комплексным управленческим платформам. </w:t>
-      </w:r>
-      <w:r>
-        <w:t>П</w:t>
-      </w:r>
-      <w:r>
-        <w:t>роектирование таких систем требует особого внимания к организационному обеспечению: в отличие от технических систем, здесь существенную роль играет человеческий фактор, сопротивление персонала изменениям, необходимость перестройки организационной структуры и перераспределения полномочий [4]. Без решения этих организационных вопросов даже технически совершенная система не даст ожидаемого эффекта.</w:t>
-      </w:r>
-    </w:p>
-    <w:p>
-      <w:r>
-        <w:t xml:space="preserve">Специфика административного управления состоит в том, что значительная часть управленческих задач является слабоструктурированной: решения принимаются в условиях неполной информации, при наличии противоречивых критериев и </w:t>
-      </w:r>
-      <w:proofErr w:type="spellStart"/>
-      <w:r>
-        <w:t>неформализуемых</w:t>
-      </w:r>
-      <w:proofErr w:type="spellEnd"/>
-      <w:r>
-        <w:t xml:space="preserve"> ограничений. В этой связи системы административного управления не заменяют руководителя, а обеспечивают его достоверной, своевременной и структурированной информацией, сокращают время на рутинные операции и моделируют последствия альтернативных решений [6]. </w:t>
-      </w:r>
-      <w:r>
-        <w:t>Э</w:t>
-      </w:r>
-      <w:r>
-        <w:t>ффективность таких систем определяется не столько их технической сложностью, сколько степенью адекватности информационных моделей реальным управленческим процессам организации [6].</w:t>
-      </w:r>
-    </w:p>
-    <w:p>
-      <w:r>
-        <w:t>В современных условиях системы организационно-экономического управления всё активнее интегрируются с внешними информационными средами: электронными площадками государственных закупок, системами межбанковского обмена, порталами налоговых органов. Это превращает их из внутрикорпоративных инструментов в элемент цифровой экосистемы предприятия [1].</w:t>
-      </w:r>
-    </w:p>
-    <w:p>
-      <w:pPr>
-        <w:rPr>
-          <w:b/>
-        </w:rPr>
-      </w:pPr>
-      <w:r>
-        <w:t>В результате получается, что к</w:t>
-      </w:r>
-      <w:r>
-        <w:t xml:space="preserve">лючевой проблемой при построении систем организационно-экономического управления является не выбор </w:t>
-      </w:r>
-      <w:r>
-        <w:lastRenderedPageBreak/>
-        <w:t xml:space="preserve">программного продукта, а предварительная формализация управленческих процедур и готовность организации к изменению устоявшихся практик. Техническая реализация вторична по отношению к организационному проектированию. </w:t>
-      </w:r>
-    </w:p>
-    <w:p>
-      <w:pPr>
-        <w:pStyle w:val="1"/>
-      </w:pPr>
-      <w:r>
-        <w:t xml:space="preserve">2. </w:t>
-      </w:r>
-      <w:r>
-        <w:t>Системы управления технологическими процессами (АСУ ТП)</w:t>
-      </w:r>
-    </w:p>
-    <w:p>
-      <w:r>
-        <w:t>Автоматизированные системы управления технологическими процессами (АСУ ТП) представляют собой класс систем, непосредственно воздействующих на физические параметры производственного процесса: температуру, давление, расход, скорость, уровень, концентрацию и другие технологические переменные. Если системы организационно-экономического управления оперируют документами и экономическими показателями, то АСУ ТП работает с сигналами датчиков и исполнительных механизмов в реальном времени [2].</w:t>
-      </w:r>
-    </w:p>
-    <w:p>
-      <w:r>
-        <w:t>Иерархическая структура АСУ ТП.</w:t>
-      </w:r>
-      <w:r>
-        <w:t xml:space="preserve"> В</w:t>
-      </w:r>
-      <w:r>
-        <w:t xml:space="preserve"> современных АСУ ТП </w:t>
-      </w:r>
-      <w:r>
-        <w:t xml:space="preserve">выделяется </w:t>
-      </w:r>
-      <w:r>
-        <w:t>несколько уровней [2]. Нижний (полевой) уровень включает датчики, преобразователи, исполнительные механизмы и средства локальной автоматики. Контроллерный уровень представлен программируемыми логическими контроллерами (ПЛК), промышленными компьютерами и регуляторами, реализующими алгоритмы управления в реальном времени с циклом от миллисекунд до секунд. Диспетчерский уровень обеспечивается SCADA-системами (</w:t>
-      </w:r>
-      <w:proofErr w:type="spellStart"/>
-      <w:r>
-        <w:t>Supervisory</w:t>
-      </w:r>
-      <w:proofErr w:type="spellEnd"/>
-      <w:r>
-        <w:t xml:space="preserve"> Control And Data </w:t>
-      </w:r>
-      <w:proofErr w:type="spellStart"/>
-      <w:r>
-        <w:t>Acquisition</w:t>
-      </w:r>
-      <w:proofErr w:type="spellEnd"/>
-      <w:r>
-        <w:t>), которые осуществляют визуализацию технологического процесса, архивирование данных, формирование аварийных сигналов и предоставление оператору средств оперативного вмешательства. Верхний уровень связывает АСУ ТП с корпоративными системами управления предприятием (MES, ERP), передавая данные о фактическом выполнении производственных заданий и получая плановые параметры.</w:t>
-      </w:r>
-    </w:p>
-    <w:p>
-      <w:r>
-        <w:t xml:space="preserve">Основные функции АСУ ТП включают: непрерывный сбор и первичную обработку данных о состоянии технологического объекта; автоматическое регулирование параметров по заданным уставкам и алгоритмам; логическое и </w:t>
-      </w:r>
-      <w:r>
-        <w:lastRenderedPageBreak/>
-        <w:t>программное управление последовательностями операций; противоаварийную защиту и блокировки; оперативное отображение информации для персонала; архивирование и формирование отчётности по технологическим параметрам; дистанционное управление оборудованием [2].</w:t>
-      </w:r>
-    </w:p>
-    <w:p>
-      <w:r>
-        <w:t>Принципы построения АСУ ТП существенно отличаются от принципов проектирования организационно-экономических систем. На первый план выходят требования реального времени (детерминированность времени отклика), надёжности и отказоустойчивости (резервирование каналов, контроллеров, источников питания), безопасности (защита от несанкционированного доступа, аварийные блокировки) и электромагнитной совместимости в условиях промышленного производства [2].</w:t>
-      </w:r>
-      <w:r>
-        <w:t xml:space="preserve"> П</w:t>
-      </w:r>
-      <w:r>
-        <w:t>роектирование АСУ ТП ведётся на основе детального изучения объекта управления: технологического регламента, характеристик оборудования, допустимых диапазонов параметров и сценариев нештатных ситуаций [2].</w:t>
-      </w:r>
-    </w:p>
-    <w:p>
-      <w:r>
-        <w:t>Типы АСУ ТП по характеру объекта управления. Выделяют системы управления непрерывными процессами (химическое производство, энергетика, металлургия), где параметры изменяются плавно и регулируются аналоговыми или цифровыми регуляторами; системы управления дискретными процессами (сборочные линии, станки с ЧПУ, робототехнические комплексы), где управление сводится к логическим последовательностям операций; и гибридные системы, сочетающие оба типа, характерные для современных гибких производственных систем [8].</w:t>
-      </w:r>
-    </w:p>
-    <w:p>
-      <w:r>
-        <w:t xml:space="preserve">Тенденции развития. Современные АСУ ТП эволюционируют в направлении распределённых архитектур (распределённые системы управления, DCS), применения промышленных сетей (PROFINET, </w:t>
-      </w:r>
-      <w:proofErr w:type="spellStart"/>
-      <w:r>
-        <w:t>EtherCAT</w:t>
-      </w:r>
-      <w:proofErr w:type="spellEnd"/>
-      <w:r>
-        <w:t>, OPC UA), внедрения элементов искусственного интеллекта для предиктивной аналитики оборудования и цифровых двойников технологических процессов [2]. Концепция «Индустрия 4.0» предполагает конвергенцию АСУ ТП с корпоративными информационными системами, что размывает границу между оперативным и стратегическим уровнями управления производством [8].</w:t>
-      </w:r>
-    </w:p>
-    <w:p>
-      <w:pPr>
-        <w:rPr>
-          <w:b/>
-        </w:rPr>
-      </w:pPr>
-      <w:r>
-        <w:lastRenderedPageBreak/>
-        <w:t xml:space="preserve">Подводя итог, </w:t>
-      </w:r>
-      <w:r>
-        <w:t xml:space="preserve">АСУ ТП является тем звеном автоматизации, где цена ошибки наиболее высока — от качества проектирования и надёжности функционирования зависят не только экономические показатели, но и безопасность персонала и окружающей среды. Поэтому при построении АСУ ТП приоритет всегда отдаётся надёжности и детерминизму, а не гибкости и скорости внедрения. </w:t>
-      </w:r>
-    </w:p>
-    <w:p>
-      <w:pPr>
-        <w:pStyle w:val="1"/>
-      </w:pPr>
-      <w:r>
-        <w:t xml:space="preserve">3. </w:t>
-      </w:r>
-      <w:r>
-        <w:t>Корпоративные информационные системы</w:t>
-      </w:r>
-    </w:p>
-    <w:p>
-      <w:r>
-        <w:t>Корпоративная информационная система (КИС) представляет собой интегрированный комплекс программных, аппаратных, информационных и организационных средств, обеспечивающий автоматизацию всего спектра управленческой и производственной деятельности предприятия в едином информационном пространстве. КИС не является отдельным классом систем наряду с АСУ ТП или системами организационного управления; скорее, она выступает интеграционной средой, объединяющей разнородные подсистемы в согласованное целое [7].</w:t>
-      </w:r>
-    </w:p>
-    <w:p>
-      <w:r>
-        <w:t xml:space="preserve">Функциональная архитектура КИС. </w:t>
-      </w:r>
-      <w:r>
-        <w:t>В</w:t>
-      </w:r>
-      <w:r>
-        <w:t xml:space="preserve"> составе КИС </w:t>
-      </w:r>
-      <w:r>
-        <w:t xml:space="preserve">выделяются </w:t>
-      </w:r>
-      <w:r>
-        <w:t>следующие основные функциональные подсистемы: управление производством (планирование, диспетчирование, учёт выработки), управление финансами (бухгалтерский учёт, бюджетирование, расчёт себестоимости), управление персоналом (кадровый учёт, расчёт заработной платы, планирование обучения), управление материальными ресурсами и логистикой (закупки, складской учёт, управление цепями поставок), управление взаимоотношениями с клиентами (CRM), управление проектами и качеством [7]. Каждая подсистема реализует замкнутый контур управления своей предметной областью, при этом данные передаются между подсистемами без повторного ввода.</w:t>
-      </w:r>
-    </w:p>
-    <w:p>
-      <w:r>
-        <w:t xml:space="preserve">Модульный принцип построения. Современные КИС реализуются в виде набора модулей, которые могут внедряться поэтапно в зависимости от приоритетов предприятия. Это позволяет снизить первоначальные инвестиции и риски внедрения: сначала автоматизируются наиболее критичные функции </w:t>
-      </w:r>
-      <w:r>
-        <w:lastRenderedPageBreak/>
-        <w:t>(например, бухгалтерский учёт и управление запасами), затем подключаются модули планирования производства, управления качеством и т. д. [7]. При этом модули используют общую базу данных и единые справочники, что обеспечивает непротиворечивость информации.</w:t>
-      </w:r>
-    </w:p>
-    <w:p>
-      <w:r>
-        <w:t xml:space="preserve">Интеграционная роль КИС. Принципиальным отличием КИС от набора разрозненных автоматизированных рабочих мест является обеспечение сквозных информационных потоков. </w:t>
-      </w:r>
-      <w:r>
-        <w:t>И</w:t>
-      </w:r>
-      <w:r>
-        <w:t>менно интеграция позволяет перейти от реактивного управления (реагирование на уже возникшие проблемы) к проактивному (предупреждение проблем на основе прогнозной аналитики) [1]. Например, данные о фактическом расходе материалов, поступающие из АСУ ТП или производственного модуля, автоматически отражаются в финансовой подсистеме как себестоимость продукции и в логистической — как основание для формирования заявки на пополнение запасов.</w:t>
-      </w:r>
-    </w:p>
-    <w:p>
-      <w:r>
-        <w:t>Уровни управления и КИС. КИС обслуживает все уровни управления предприятием. Оперативный уровень получает информацию о текущем состоянии заказов, загрузке оборудования, наличии материалов. Тактический уровень использует данные для среднесрочного планирования, анализа эффективности подразделений, оптимизации ресурсов. Стратегический уровень опирается на агрегированные показатели и прогнозные модели для принятия решений о развитии, инвестициях и позиционировании на рынке [6]. Таким образом, КИС обеспечивает единую вертикаль информации от цеха до совета директоров.</w:t>
-      </w:r>
-    </w:p>
-    <w:p>
-      <w:r>
-        <w:t xml:space="preserve">Проблемы внедрения. Опыт показывает, что внедрение КИС является не столько техническим, сколько организационным проектом. </w:t>
-      </w:r>
-      <w:r>
-        <w:t>П</w:t>
-      </w:r>
-      <w:r>
-        <w:t>роектирование информационной системы неотделимо от реинжиниринга бизнес-процессов: попытка автоматизировать неэффективные процедуры лишь закрепляет и масштабирует их недостатки [3]. Типичными рисками являются сопротивление персонала, недооценка объёма работ по миграции данных, недостаточное обучение пользователей и отсутствие чёткого целеполагания со стороны руководства [3].</w:t>
-      </w:r>
-    </w:p>
-    <w:p>
-      <w:r>
-        <w:lastRenderedPageBreak/>
-        <w:t>Перспективы развития. Современные КИС эволюционируют в сторону облачных архитектур (</w:t>
-      </w:r>
-      <w:proofErr w:type="spellStart"/>
-      <w:r>
-        <w:t>SaaS</w:t>
-      </w:r>
-      <w:proofErr w:type="spellEnd"/>
-      <w:r>
-        <w:t>-модель), включения аналитических платформ на основе больших данных и машинного обучения, интеграции с промышленным интернетом вещей (</w:t>
-      </w:r>
-      <w:proofErr w:type="spellStart"/>
-      <w:r>
-        <w:t>IIoT</w:t>
-      </w:r>
-      <w:proofErr w:type="spellEnd"/>
-      <w:r>
-        <w:t>) и расширения мобильных сценариев работы. Граница между КИС, АСУ ТП и внешними сервисами постепенно размывается, формируя единую цифровую платформу предприятия [1].</w:t>
-      </w:r>
-    </w:p>
-    <w:p>
-      <w:r>
-        <w:t>В результате видим следующий вывод. К</w:t>
-      </w:r>
-      <w:r>
-        <w:t xml:space="preserve">орпоративная информационная система является не самоцелью, а инструментом реализации стратегии предприятия. Успешность КИС определяется не количеством внедрённых модулей и не стоимостью лицензий, а тем, насколько сократилось время принятия решений, снизилась доля ошибок и повысилась прозрачность управления. Внедрение КИС без предварительной оптимизации бизнес-процессов и без активной роли первого руководителя обречено на формальный результат. </w:t>
+        <w:t>, OPC UA), предиктивной аналитики на основе машинного обучения и концепции цифровых двойников. В. В. Баронов и соавторы указывают, что интеграция АСУ ТП с корпоративным уровнем через промышленный интернет вещей стирает традиционную границу между оперативным и управленческим контурами, формируя единую цифровую среду производства [1].</w:t>
+      </w:r>
+    </w:p>
+    <w:p>
+      <w:r>
+        <w:t>Подводя итоги можно сказать, что</w:t>
+      </w:r>
+      <w:r>
+        <w:t xml:space="preserve"> АСУ ТП является тем уровнем автоматизации, где технические решения имеют непосредственные физические последствия. Поэтому при проектировании АСУ ТП приоритет всегда отдаётся надёжности, детерминизму и безопасности, а не гибкости или скорости внедрения. Любое управленческое решение на уровне предприятия в конечном счёте реализуется через АСУ ТП, и именно здесь определяется, будет ли план выполнен в материальном мире.</w:t>
+      </w:r>
+      <w:r>
+        <w:t xml:space="preserve"> </w:t>
       </w:r>
     </w:p>
     <w:p>

</xml_diff>

<commit_message>
vault backup: 2026-10-19 21:05:33
</commit_message>
<xml_diff>
--- a/ПРЕДМЕТЫ/Автоматизированные производственные системы/Эссе/Эссе 3/Поповкин. Эссе 3.docx
+++ b/ПРЕДМЕТЫ/Автоматизированные производственные системы/Эссе/Эссе 3/Поповкин. Эссе 3.docx
@@ -672,6 +672,216 @@
       </w:r>
     </w:p>
     <w:p>
+      <w:r>
+        <w:t>Организационно-техническая система — система, объединяющая технические средства, технологические процессы и людей, взаимодействующих для достижения общей производственной цели</w:t>
+      </w:r>
+      <w:r>
+        <w:t>.</w:t>
+      </w:r>
+    </w:p>
+    <w:p>
+      <w:r>
+        <w:t>Прямая связь — канал передачи управляющего воздействия от субъекта управления (руководителя, системы) к объекту управления (подразделению, оборудованию)</w:t>
+      </w:r>
+      <w:r>
+        <w:t>.</w:t>
+      </w:r>
+    </w:p>
+    <w:p>
+      <w:r>
+        <w:t>Обратная связь — канал возврата информации о результатах исполнения управляющего воздействия к субъекту управления для корректировки последующих решений</w:t>
+      </w:r>
+      <w:r>
+        <w:t>.</w:t>
+      </w:r>
+    </w:p>
+    <w:p>
+      <w:r>
+        <w:t>Открытая система — система, непрерывно обменивающаяся с внешней средой энергией, веществом и информацией, в отличие от замкнутой (изолированной) системы</w:t>
+      </w:r>
+      <w:r>
+        <w:t>.</w:t>
+      </w:r>
+    </w:p>
+    <w:p>
+      <w:r>
+        <w:t>Декомпозиция целей — процесс разбиения стратегической цели предприятия на иерархически соподчинённые тактические и оперативные задачи, назначаемые конкретным подразделениям и исполнителям</w:t>
+      </w:r>
+      <w:r>
+        <w:t>.</w:t>
+      </w:r>
+    </w:p>
+    <w:p>
+      <w:r>
+        <w:t>Жизненный цикл изделия — последовательность этапов существования продукции от формирования концепции и проектирования через производство и эксплуатацию до утилизации</w:t>
+      </w:r>
+      <w:r>
+        <w:t>.</w:t>
+      </w:r>
+    </w:p>
+    <w:p>
+      <w:r>
+        <w:t>Внешняя среда предприятия — совокупность факторов и субъектов за пределами организации (рынки, конкуренты, регуляторы, поставщики), оказывающих влияние на условия её функционирования</w:t>
+      </w:r>
+      <w:r>
+        <w:t>.</w:t>
+      </w:r>
+    </w:p>
+    <w:p>
+      <w:r>
+        <w:t xml:space="preserve">Цифровая нить (Digital </w:t>
+      </w:r>
+      <w:proofErr w:type="spellStart"/>
+      <w:r>
+        <w:t>Thread</w:t>
+      </w:r>
+      <w:proofErr w:type="spellEnd"/>
+      <w:r>
+        <w:t>) — непрерывная информационная связь между всеми этапами жизненного цикла изделия</w:t>
+      </w:r>
+      <w:r>
+        <w:t>.</w:t>
+      </w:r>
+    </w:p>
+    <w:p>
+      <w:r>
+        <w:t>АСУП (автоматизированная система управления предприятием) — комплекс программных, технических, информационных и организационных средств, автоматизирующий управленческие функции на уровне предприятия как хозяйствующего субъекта</w:t>
+      </w:r>
+      <w:r>
+        <w:t>.</w:t>
+      </w:r>
+    </w:p>
+    <w:p>
+      <w:r>
+        <w:lastRenderedPageBreak/>
+        <w:t>Функциональная подсистема АСУП — выделенный по управленческой функции компонент АСУП (финансы, производство, персонал, логистика), реализующий замкнутый цикл управления в своей предметной области</w:t>
+      </w:r>
+      <w:r>
+        <w:t>.</w:t>
+      </w:r>
+    </w:p>
+    <w:p>
+      <w:r>
+        <w:t>Единая база данных предприятия — централизованное хранилище структурированной информации, обеспечивающее однократный ввод и многократное использование данных всеми подсистемами АСУП</w:t>
+      </w:r>
+      <w:r>
+        <w:t>.</w:t>
+      </w:r>
+    </w:p>
+    <w:p>
+      <w:r>
+        <w:t>Нормативно-плановая информация — совокупность данных, определяющих плановые параметры производства: нормы расхода, маршрутные карты, спецификации, плановые калькуляции</w:t>
+      </w:r>
+      <w:r>
+        <w:t>.</w:t>
+      </w:r>
+    </w:p>
+    <w:p>
+      <w:r>
+        <w:t>Организационное обеспечение АСУП — совокупность документов, регламентов, должностных инструкций и организационных структур, определяющих порядок функционирования системы в организации</w:t>
+      </w:r>
+      <w:r>
+        <w:t>.</w:t>
+      </w:r>
+    </w:p>
+    <w:p>
+      <w:r>
+        <w:t>Контур управления — замкнутая последовательность этапов управления: формирование плана, исполнение, учёт фактических результатов, анализ отклонений, корректирующее воздействие</w:t>
+      </w:r>
+      <w:r>
+        <w:t>.</w:t>
+      </w:r>
+    </w:p>
+    <w:p>
+      <w:r>
+        <w:t>Пакетная обработка — режим обработки данных, при котором информация накапливается за определённый период и обрабатывается одномоментно, в отличие от оперативного режима обработки в момент поступления</w:t>
+      </w:r>
+      <w:r>
+        <w:t>.</w:t>
+      </w:r>
+    </w:p>
+    <w:p>
+      <w:r>
+        <w:t>Объект управления — технологический процесс, установка или оборудование, на которые АСУ ТП воздействует через исполнительные механизмы для поддержания заданных параметров</w:t>
+      </w:r>
+      <w:r>
+        <w:t>.</w:t>
+      </w:r>
+    </w:p>
+    <w:p>
+      <w:r>
+        <w:t>Уставка — заданное значение технологического параметра (температуры, давления, расхода), которое система автоматического регулирования стремится поддерживать</w:t>
+      </w:r>
+      <w:r>
+        <w:t>.</w:t>
+      </w:r>
+    </w:p>
+    <w:p>
+      <w:r>
+        <w:t>Детерминизм реального времени — свойство АСУ ТП формировать управляющее воздействие не позднее строго определённого предельного времени, определяемого динамикой объекта управления</w:t>
+      </w:r>
+      <w:r>
+        <w:t>.</w:t>
+      </w:r>
+    </w:p>
+    <w:p>
+      <w:r>
+        <w:lastRenderedPageBreak/>
+        <w:t>Противоаварийная защита (ПАЗ) — независимая от основной системы управления совокупность технических средств, автоматически переводящих объект в безопасное состояние при выходе параметров за аварийные пределы</w:t>
+      </w:r>
+      <w:r>
+        <w:t>.</w:t>
+      </w:r>
+    </w:p>
+    <w:p>
+      <w:r>
+        <w:t>Полевой уровень АСУ ТП — нижний уровень иерархии системы, включающий датчики, преобразователи сигналов и исполнительные механизмы, непосредственно контактирующие с технологическим объектом</w:t>
+      </w:r>
+      <w:r>
+        <w:t>.</w:t>
+      </w:r>
+    </w:p>
+    <w:p>
+      <w:r>
+        <w:t xml:space="preserve">Промышленный сетевой протокол — стандартизованный формат и правила обмена данными между устройствами промышленной автоматизации (PROFINET, </w:t>
+      </w:r>
+      <w:proofErr w:type="spellStart"/>
+      <w:r>
+        <w:t>EtherCAT</w:t>
+      </w:r>
+      <w:proofErr w:type="spellEnd"/>
+      <w:r>
+        <w:t xml:space="preserve">, </w:t>
+      </w:r>
+      <w:proofErr w:type="spellStart"/>
+      <w:r>
+        <w:t>Modbus</w:t>
+      </w:r>
+      <w:proofErr w:type="spellEnd"/>
+      <w:r>
+        <w:t>, OPC UA)</w:t>
+      </w:r>
+      <w:r>
+        <w:t>.</w:t>
+      </w:r>
+    </w:p>
+    <w:p>
+      <w:r>
+        <w:t>Предиктивная аналитика — метод прогнозирования отказов оборудования и отклонений технологических параметров на основе анализа исторических данных и моделей машинного обучения</w:t>
+      </w:r>
+      <w:r>
+        <w:t>.</w:t>
+      </w:r>
+    </w:p>
+    <w:p>
+      <w:r>
+        <w:t>Цифровой двойник — виртуальная модель технологического объекта, синхронизированная с физическим объектом в реальном времени и используемая для мониторинга, имитации и оптимизации режимов работы</w:t>
+      </w:r>
+      <w:r>
+        <w:t>.</w:t>
+      </w:r>
+    </w:p>
+    <w:p>
       <w:pPr>
         <w:pStyle w:val="1"/>
         <w:ind w:firstLine="0"/>
@@ -725,7 +935,13 @@
     </w:p>
     <w:p>
       <w:r>
-        <w:t>Динамичность и жизненный цикл. Предприятие не является статичным объектом: оно проходит стадии создания, становления, роста, зрелости и трансформации или упадка. На каждой стадии изменяются приоритеты управления, организационная структура, требования к информационным системам. Ю. В. Псигин подчёркивает, что управление производственной системой должно учитывать не только текущее состояние, но и траекторию развития, закладывая в управленческие решения элемент прогнозирования [8].</w:t>
+        <w:t>Динамичность и жизненный цикл. Предприятие не является статичным объектом: оно проходит стадии создания, становления, роста, зрелости и трансформации или упадка. На каждой стадии изменяются приоритеты управления, организационная структура, требования к информационным системам.</w:t>
+      </w:r>
+      <w:r>
+        <w:t xml:space="preserve"> У</w:t>
+      </w:r>
+      <w:r>
+        <w:t>правление производственной системой должно учитывать не только текущее состояние, но и траекторию развития, закладывая в управленческие решения элемент прогнозирования [8].</w:t>
       </w:r>
     </w:p>
     <w:p>
@@ -740,7 +956,13 @@
         </w:rPr>
       </w:pPr>
       <w:r>
-        <w:t>Таким образом, современное предприятие как объект управления характеризуется системностью, открытостью, многокритериальностью, динамичностью и информационной насыщенностью. Ни одно из этих свойств не может быть проигнорировано при проектировании управленческих механизмов. Авторская позиция: адекватное управление предприятием возможно лишь при условии, что управленческая система отражает сложность управляемого объекта — упрощение модели предприятия неизбежно ведёт к потере управляемости и принятию неэффективных решений.</w:t>
+        <w:t xml:space="preserve">Таким образом, современное предприятие как объект управления характеризуется системностью, открытостью, многокритериальностью, динамичностью и информационной насыщенностью. Ни одно из этих свойств не может быть проигнорировано при проектировании управленческих механизмов. </w:t>
+      </w:r>
+      <w:r>
+        <w:t>А</w:t>
+      </w:r>
+      <w:r>
+        <w:t>декватное управление предприятием возможно лишь при условии, что управленческая система отражает сложность управляемого объекта — упрощение модели предприятия неизбежно ведёт к потере управляемости и принятию неэффективных решений.</w:t>
       </w:r>
     </w:p>
     <w:p>
@@ -767,13 +989,31 @@
     </w:p>
     <w:p>
       <w:r>
-        <w:t>Функциональная структура АСУП. В. В. Баронов и соавторы выделяют в составе АСУП типовые функциональные подсистемы: планирование производства и материально-технического снабжения; управление финансами и экономический анализ; управление персоналом и расчёт заработной платы; управление сбытом и взаимоотношениями с клиентами; бухгалтерский учёт и отчётность; управление качеством; управление проектами и инвестициями [1]. Каждая подсистема реализует замкнутый цикл «план — исполнение — учёт — анализ — корректировка», при этом данные циркулируют между подсистемами без повторного ввода.</w:t>
+        <w:t>Функциональная структура АСУП.</w:t>
+      </w:r>
+      <w:r>
+        <w:t xml:space="preserve"> В</w:t>
+      </w:r>
+      <w:r>
+        <w:t xml:space="preserve"> составе АСУП </w:t>
+      </w:r>
+      <w:r>
+        <w:t xml:space="preserve">выделяются </w:t>
+      </w:r>
+      <w:r>
+        <w:t>типовые функциональные подсистемы: планирование производства и материально-технического снабжения; управление финансами и экономический анализ; управление персоналом и расчёт заработной платы; управление сбытом и взаимоотношениями с клиентами; бухгалтерский учёт и отчётность; управление качеством; управление проектами и инвестициями [1]. Каждая подсистема реализует замкнутый цикл «план — исполнение — учёт — анализ — корректировка», при этом данные циркулируют между подсистемами без повторного ввода.</w:t>
       </w:r>
     </w:p>
     <w:p>
       <w:r>
         <w:lastRenderedPageBreak/>
-        <w:t>Информационное обеспечение АСУП. Основу АСУП составляет единая база данных предприятия, включающая справочники (номенклатура, контрагенты, организационная структура), нормативно-плановую информацию (маршрутные карты, спецификации, плановые калькуляции), оперативные данные (заказы, остатки, транзакции) и архивную информацию для аналитики. И. Д. Рудинский подчёркивает, что качество информационного обеспечения является определяющим фактором эффективности АСУП: система, оперирующая неточными или несвоевременными данными, генерирует некорректные управленческие решения, что может быть опаснее отсутствия системы вообще [4].</w:t>
+        <w:t xml:space="preserve">Информационное обеспечение АСУП. Основу АСУП составляет единая база данных предприятия, включающая справочники (номенклатура, контрагенты, организационная структура), нормативно-плановую информацию (маршрутные карты, спецификации, плановые калькуляции), оперативные данные (заказы, остатки, транзакции) и архивную информацию для аналитики. </w:t>
+      </w:r>
+      <w:r>
+        <w:t>К</w:t>
+      </w:r>
+      <w:r>
+        <w:t>ачество информационного обеспечения является определяющим фактором эффективности АСУП: система, оперирующая неточными или несвоевременными данными, генерирует некорректные управленческие решения, что может быть опаснее отсутствия системы вообще [4].</w:t>
       </w:r>
     </w:p>
     <w:p>
@@ -783,7 +1023,13 @@
     </w:p>
     <w:p>
       <w:r>
-        <w:t>Организационные аспекты. Внедрение АСУП неизбежно влечёт изменение организационной структуры, перераспределение функций и перестройку документооборота. Как отмечает Рудинский, технология проектирования АСУП должна включать не только разработку программного и технического обеспечения, но и проектирование организационного обеспечения: новых должностных инструкций, регламентов взаимодействия подразделений, процедур принятия решений [4]. Без этой составляющей даже технически безупречная система не будет эффективно использоваться.</w:t>
+        <w:t xml:space="preserve">Организационные аспекты. Внедрение АСУП неизбежно влечёт изменение организационной структуры, перераспределение функций и перестройку документооборота. </w:t>
+      </w:r>
+      <w:r>
+        <w:t>Т</w:t>
+      </w:r>
+      <w:r>
+        <w:t>ехнология проектирования АСУП должна включать не только разработку программного и технического обеспечения, но и проектирование организационного обеспечения: новых должностных инструкций, регламентов взаимодействия подразделений, процедур принятия решений [4]. Без этой составляющей даже технически безупречная система не будет эффективно использоваться.</w:t>
       </w:r>
     </w:p>
     <w:p>
@@ -793,11 +1039,14 @@
         </w:rPr>
       </w:pPr>
       <w:r>
-        <w:t xml:space="preserve">Авторская позиция: АСУП является не просто программным продуктом, а организационно-техническим проектом, успех которого определяется в первую очередь ясностью управленческих целей и готовностью организации к </w:t>
+        <w:t xml:space="preserve">В результате видно, что </w:t>
+      </w:r>
+      <w:r>
+        <w:t xml:space="preserve">АСУП является не просто программным продуктом, а организационно-техническим проектом, успех которого определяется в первую очередь ясностью управленческих целей и готовностью </w:t>
       </w:r>
       <w:r>
         <w:lastRenderedPageBreak/>
-        <w:t>изменениям. Техническая архитектура вторична по отношению к качеству управленческих процессов, которые система должна обслуживать.</w:t>
+        <w:t>организации к изменениям. Техническая архитектура вторична по отношению к качеству управленческих процессов, которые система должна обслуживать.</w:t>
       </w:r>
       <w:r>
         <w:t xml:space="preserve"> </w:t>
@@ -826,11 +1075,32 @@
     </w:p>
     <w:p>
       <w:r>
-        <w:t xml:space="preserve">Основные функции АСУ ТП. Ю. Н. Фёдоров выделяет следующий типовой состав функций [2]: непрерывный сбор и первичная обработка данных с датчиков; автоматическое регулирование параметров по заданным уставкам; логическое и программное управление последовательностями технологических операций; противоаварийная защита и технологические блокировки; оперативное отображение информации оператору (визуализация); архивирование данных и формирование отчётов; дистанционное управление </w:t>
+        <w:t xml:space="preserve">Основные функции АСУ ТП. </w:t>
+      </w:r>
+      <w:r>
+        <w:t>Выделяется следующий</w:t>
+      </w:r>
+      <w:r>
+        <w:t xml:space="preserve"> типовой состав функци</w:t>
+      </w:r>
+      <w:r>
+        <w:t>й</w:t>
+      </w:r>
+      <w:r>
+        <w:t xml:space="preserve">: непрерывный сбор и первичная обработка данных с датчиков; автоматическое регулирование параметров по заданным уставкам; логическое и программное управление последовательностями технологических операций; противоаварийная защита и технологические блокировки; оперативное отображение информации оператору (визуализация); архивирование данных и формирование отчётов; дистанционное управление исполнительными </w:t>
       </w:r>
       <w:r>
         <w:lastRenderedPageBreak/>
-        <w:t>исполнительными механизмами; передача данных на верхний уровень управления (в MES и АСУП).</w:t>
+        <w:t>механизмами; передача данных на верхний уровень управления (в MES и АСУП)</w:t>
+      </w:r>
+      <w:r>
+        <w:t xml:space="preserve"> </w:t>
+      </w:r>
+      <w:r>
+        <w:t>[2]</w:t>
+      </w:r>
+      <w:r>
+        <w:t>.</w:t>
       </w:r>
     </w:p>
     <w:p>
@@ -862,7 +1132,13 @@
       </w:r>
       <w:proofErr w:type="spellEnd"/>
       <w:r>
-        <w:t>, OPC UA), предиктивной аналитики на основе машинного обучения и концепции цифровых двойников. В. В. Баронов и соавторы указывают, что интеграция АСУ ТП с корпоративным уровнем через промышленный интернет вещей стирает традиционную границу между оперативным и управленческим контурами, формируя единую цифровую среду производства [1].</w:t>
+        <w:t xml:space="preserve">, OPC UA), предиктивной аналитики на основе машинного обучения и концепции цифровых двойников. </w:t>
+      </w:r>
+      <w:r>
+        <w:t>И</w:t>
+      </w:r>
+      <w:r>
+        <w:t>нтеграция АСУ ТП с корпоративным уровнем через промышленный интернет вещей стирает традиционную границу между оперативным и управленческим контурами, формируя единую цифровую среду производства [1].</w:t>
       </w:r>
     </w:p>
     <w:p>
@@ -936,7 +1212,7 @@
         <w:rPr>
           <w:rFonts w:eastAsiaTheme="majorEastAsia"/>
         </w:rPr>
-        <w:t>Соловьёв И. В., Майоров А. А. Проектирование информационных систем. Фундаментальный курс : учебное пособие для высшей школы / под ред. В. П. Савиных. — М. : Академический Проект, 2009. — 398 с.</w:t>
+        <w:t>Рудинский И. Д. Технология проектирования автоматизированных систем обработки информации и управления : учебное пособие для вузов. — М. : Горячая линия – Телеком, 2011. — 304 с.</w:t>
       </w:r>
     </w:p>
     <w:p>
@@ -953,7 +1229,7 @@
         <w:rPr>
           <w:rFonts w:eastAsiaTheme="majorEastAsia"/>
         </w:rPr>
-        <w:t>Рудинский И. Д. Технология проектирования автоматизированных систем обработки информации и управления : учебное пособие для вузов. — М. : Горячая линия – Телеком, 2011. — 304 с.</w:t>
+        <w:t>Теория систем и системный анализ в управлении организациями : справочник : учебное пособие / под ред. В. Н. Волковой и А. А. Емельянова. — М. : Финансы и статистика, 2006. — 848 с.</w:t>
       </w:r>
     </w:p>
     <w:p>
@@ -970,7 +1246,7 @@
         <w:rPr>
           <w:rFonts w:eastAsiaTheme="majorEastAsia"/>
         </w:rPr>
-        <w:t>Прикладная информатика : справочник : учебное пособие / под ред. В. Н. Волковой и В. Н. Юрьева. — М. : Финансы и статистика; ИНФРА-М, 2008. — 768 с.</w:t>
+        <w:t>Псигин Ю. В. Управление производственными системами : учебно-методическое пособие. — Ульяновск : УлГТУ, 2019. — 180 с.</w:t>
       </w:r>
     </w:p>
     <w:p>
@@ -987,67 +1263,7 @@
         <w:rPr>
           <w:rFonts w:eastAsiaTheme="majorEastAsia"/>
         </w:rPr>
-        <w:t>Теория систем и системный анализ в управлении организациями : справочник : учебное пособие / под ред. В. Н. Волковой и А. А. Емельянова. — М. : Финансы и статистика, 2006. — 848 с.</w:t>
-      </w:r>
-    </w:p>
-    <w:p>
-      <w:pPr>
-        <w:numPr>
-          <w:ilvl w:val="0"/>
-          <w:numId w:val="8"/>
-        </w:numPr>
-        <w:rPr>
-          <w:rFonts w:eastAsiaTheme="majorEastAsia"/>
-        </w:rPr>
-      </w:pPr>
-      <w:r>
-        <w:rPr>
-          <w:rFonts w:eastAsiaTheme="majorEastAsia"/>
-        </w:rPr>
-        <w:t xml:space="preserve">Погонин В. А., </w:t>
-      </w:r>
-      <w:proofErr w:type="spellStart"/>
-      <w:r>
-        <w:rPr>
-          <w:rFonts w:eastAsiaTheme="majorEastAsia"/>
-        </w:rPr>
-        <w:t>Схиртладзе</w:t>
-      </w:r>
-      <w:proofErr w:type="spellEnd"/>
-      <w:r>
-        <w:rPr>
-          <w:rFonts w:eastAsiaTheme="majorEastAsia"/>
-        </w:rPr>
-        <w:t xml:space="preserve"> А. Г., Татаренко С. И., Путин С. Б. Корпоративные информационные системы : учебное пособие. — Тамбов : Изд-во ФГБОУ ВПО «ТГТУ», 2012. — 14</w:t>
-      </w:r>
-      <w:r>
-        <w:rPr>
-          <w:rFonts w:eastAsiaTheme="majorEastAsia"/>
-        </w:rPr>
-        <w:t>5</w:t>
-      </w:r>
-      <w:r>
-        <w:rPr>
-          <w:rFonts w:eastAsiaTheme="majorEastAsia"/>
-        </w:rPr>
-        <w:t xml:space="preserve"> с.</w:t>
-      </w:r>
-    </w:p>
-    <w:p>
-      <w:pPr>
-        <w:numPr>
-          <w:ilvl w:val="0"/>
-          <w:numId w:val="8"/>
-        </w:numPr>
-        <w:rPr>
-          <w:rFonts w:eastAsiaTheme="majorEastAsia"/>
-        </w:rPr>
-      </w:pPr>
-      <w:r>
-        <w:rPr>
-          <w:rFonts w:eastAsiaTheme="majorEastAsia"/>
-        </w:rPr>
-        <w:t>Псигин Ю. В. Управление производственными системами : учебно-методическое пособие. — Ульяновск : УлГТУ, 2019. — 180 с.</w:t>
+        <w:t>Яблочников Е. И., Фомина Ю. Н., Саломатина А. А. Компьютерные технологии в жизненном цикле изделия : учебное пособие. — СПб. : СПбГУ ИТМО, 2010. — 188 с.</w:t>
       </w:r>
     </w:p>
     <w:sectPr>
@@ -2231,6 +2447,119 @@
         <w:rFonts w:ascii="Wingdings" w:hAnsi="Wingdings" w:hint="default"/>
         <w:sz w:val="20"/>
       </w:rPr>
+    </w:lvl>
+  </w:abstractNum>
+  <w:abstractNum w:abstractNumId="9" w15:restartNumberingAfterBreak="0">
+    <w:nsid w:val="6E5A3FB0"/>
+    <w:multiLevelType w:val="multilevel"/>
+    <w:tmpl w:val="2804976C"/>
+    <w:lvl w:ilvl="0">
+      <w:start w:val="1"/>
+      <w:numFmt w:val="decimal"/>
+      <w:lvlText w:val="%1."/>
+      <w:lvlJc w:val="left"/>
+      <w:pPr>
+        <w:tabs>
+          <w:tab w:val="num" w:pos="720"/>
+        </w:tabs>
+        <w:ind w:left="720" w:hanging="360"/>
+      </w:pPr>
+    </w:lvl>
+    <w:lvl w:ilvl="1" w:tentative="1">
+      <w:start w:val="1"/>
+      <w:numFmt w:val="decimal"/>
+      <w:lvlText w:val="%2."/>
+      <w:lvlJc w:val="left"/>
+      <w:pPr>
+        <w:tabs>
+          <w:tab w:val="num" w:pos="1440"/>
+        </w:tabs>
+        <w:ind w:left="1440" w:hanging="360"/>
+      </w:pPr>
+    </w:lvl>
+    <w:lvl w:ilvl="2" w:tentative="1">
+      <w:start w:val="1"/>
+      <w:numFmt w:val="decimal"/>
+      <w:lvlText w:val="%3."/>
+      <w:lvlJc w:val="left"/>
+      <w:pPr>
+        <w:tabs>
+          <w:tab w:val="num" w:pos="2160"/>
+        </w:tabs>
+        <w:ind w:left="2160" w:hanging="360"/>
+      </w:pPr>
+    </w:lvl>
+    <w:lvl w:ilvl="3" w:tentative="1">
+      <w:start w:val="1"/>
+      <w:numFmt w:val="decimal"/>
+      <w:lvlText w:val="%4."/>
+      <w:lvlJc w:val="left"/>
+      <w:pPr>
+        <w:tabs>
+          <w:tab w:val="num" w:pos="2880"/>
+        </w:tabs>
+        <w:ind w:left="2880" w:hanging="360"/>
+      </w:pPr>
+    </w:lvl>
+    <w:lvl w:ilvl="4" w:tentative="1">
+      <w:start w:val="1"/>
+      <w:numFmt w:val="decimal"/>
+      <w:lvlText w:val="%5."/>
+      <w:lvlJc w:val="left"/>
+      <w:pPr>
+        <w:tabs>
+          <w:tab w:val="num" w:pos="3600"/>
+        </w:tabs>
+        <w:ind w:left="3600" w:hanging="360"/>
+      </w:pPr>
+    </w:lvl>
+    <w:lvl w:ilvl="5" w:tentative="1">
+      <w:start w:val="1"/>
+      <w:numFmt w:val="decimal"/>
+      <w:lvlText w:val="%6."/>
+      <w:lvlJc w:val="left"/>
+      <w:pPr>
+        <w:tabs>
+          <w:tab w:val="num" w:pos="4320"/>
+        </w:tabs>
+        <w:ind w:left="4320" w:hanging="360"/>
+      </w:pPr>
+    </w:lvl>
+    <w:lvl w:ilvl="6" w:tentative="1">
+      <w:start w:val="1"/>
+      <w:numFmt w:val="decimal"/>
+      <w:lvlText w:val="%7."/>
+      <w:lvlJc w:val="left"/>
+      <w:pPr>
+        <w:tabs>
+          <w:tab w:val="num" w:pos="5040"/>
+        </w:tabs>
+        <w:ind w:left="5040" w:hanging="360"/>
+      </w:pPr>
+    </w:lvl>
+    <w:lvl w:ilvl="7" w:tentative="1">
+      <w:start w:val="1"/>
+      <w:numFmt w:val="decimal"/>
+      <w:lvlText w:val="%8."/>
+      <w:lvlJc w:val="left"/>
+      <w:pPr>
+        <w:tabs>
+          <w:tab w:val="num" w:pos="5760"/>
+        </w:tabs>
+        <w:ind w:left="5760" w:hanging="360"/>
+      </w:pPr>
+    </w:lvl>
+    <w:lvl w:ilvl="8" w:tentative="1">
+      <w:start w:val="1"/>
+      <w:numFmt w:val="decimal"/>
+      <w:lvlText w:val="%9."/>
+      <w:lvlJc w:val="left"/>
+      <w:pPr>
+        <w:tabs>
+          <w:tab w:val="num" w:pos="6480"/>
+        </w:tabs>
+        <w:ind w:left="6480" w:hanging="360"/>
+      </w:pPr>
     </w:lvl>
   </w:abstractNum>
   <w:num w:numId="1" w16cid:durableId="1302006130">
@@ -2259,6 +2588,9 @@
   </w:num>
   <w:num w:numId="9" w16cid:durableId="1178886793">
     <w:abstractNumId w:val="0"/>
+  </w:num>
+  <w:num w:numId="10" w16cid:durableId="1432161224">
+    <w:abstractNumId w:val="9"/>
   </w:num>
 </w:numbering>
 </file>

</xml_diff>

<commit_message>
vault backup: 2026-10-19 21:08:11
</commit_message>
<xml_diff>
--- a/ПРЕДМЕТЫ/Автоматизированные производственные системы/Эссе/Эссе 3/Поповкин. Эссе 3.docx
+++ b/ПРЕДМЕТЫ/Автоматизированные производственные системы/Эссе/Эссе 3/Поповкин. Эссе 3.docx
@@ -899,7 +899,13 @@
     </w:p>
     <w:p>
       <w:r>
-        <w:t>Современное промышленное предприятие представляет собой сложную организационно-техническую систему, в которой материальные, информационные, финансовые и кадровые потоки преобразуются в продукцию или услугу, обладающую рыночной ценностью. Как объект управления предприятие обладает рядом свойств, определяющих специфику и сложность управленческих задач [6].</w:t>
+        <w:t xml:space="preserve">Современное промышленное предприятие представляет собой сложную организационно-техническую систему, в которой материальные, информационные, финансовые и кадровые потоки преобразуются в продукцию или услугу, обладающую рыночной ценностью. Как объект управления предприятие обладает рядом свойств, определяющих специфику и сложность управленческих задач </w:t>
+      </w:r>
+      <w:r>
+        <w:t>[4]</w:t>
+      </w:r>
+      <w:r>
+        <w:t>.</w:t>
       </w:r>
     </w:p>
     <w:p>
@@ -916,12 +922,24 @@
         <w:t xml:space="preserve">выделяются </w:t>
       </w:r>
       <w:r>
-        <w:t>прямые связи (управляющие воздействия от субъекта к объекту) и обратные связи (информация о результатах исполнения, возвращающаяся к лицу, принявшему решение) [6]. Именно наличие контуров обратной связи принципиально отличает управляемую систему от простого набора ресурсов: без обратной связи управление вырождается в однократное воздействие без возможности коррекции.</w:t>
-      </w:r>
-    </w:p>
-    <w:p>
-      <w:r>
-        <w:t>Открытость и взаимодействие со средой. Предприятие является открытой системой, непрерывно обменивающейся с внешней средой ресурсами, информацией и продукцией. Входы системы — сырьё, материалы, энергия, рабочая сила, инвестиции, нормативные требования; выходы — готовая продукция, отходы, финансовые результаты, информация для акционеров и регуляторов. Изменчивость внешней среды — колебания спроса, действия конкурентов, технологические сдвиги, изменения законодательства — делает управление предприятием по сути задачей адаптации к непрерывно меняющимся условиям [6].</w:t>
+        <w:t xml:space="preserve">прямые связи (управляющие воздействия от субъекта к объекту) и обратные связи (информация о результатах исполнения, возвращающаяся к лицу, принявшему решение) </w:t>
+      </w:r>
+      <w:r>
+        <w:t>[4]</w:t>
+      </w:r>
+      <w:r>
+        <w:t>. Именно наличие контуров обратной связи принципиально отличает управляемую систему от простого набора ресурсов: без обратной связи управление вырождается в однократное воздействие без возможности коррекции.</w:t>
+      </w:r>
+    </w:p>
+    <w:p>
+      <w:r>
+        <w:t xml:space="preserve">Открытость и взаимодействие со средой. Предприятие является открытой системой, непрерывно обменивающейся с внешней средой ресурсами, информацией и продукцией. Входы системы — сырьё, материалы, энергия, рабочая сила, инвестиции, нормативные требования; выходы — готовая продукция, отходы, финансовые результаты, информация для акционеров и регуляторов. Изменчивость внешней среды — колебания спроса, действия конкурентов, технологические сдвиги, изменения законодательства — делает управление предприятием по сути задачей адаптации к непрерывно меняющимся условиям </w:t>
+      </w:r>
+      <w:r>
+        <w:t>[4]</w:t>
+      </w:r>
+      <w:r>
+        <w:t>.</w:t>
       </w:r>
     </w:p>
     <w:p>
@@ -941,12 +959,12 @@
         <w:t xml:space="preserve"> У</w:t>
       </w:r>
       <w:r>
-        <w:t>правление производственной системой должно учитывать не только текущее состояние, но и траекторию развития, закладывая в управленческие решения элемент прогнозирования [8].</w:t>
-      </w:r>
-    </w:p>
-    <w:p>
-      <w:r>
-        <w:t>Информационная насыщенность. В современном производстве доля информационного компонента в стоимости продукции неуклонно растёт. Управление предприятием сегодня — это в значительной мере управление данными: их сбором, верификацией, интерпретацией и превращением в решения. Е. И. Яблочников и соавторы обращают внимание на то, что информационные технологии пронизывают весь жизненный цикл изделия — от концепции и проектирования до производства, эксплуатации и утилизации, — и управление предприятием невозможно без сквозной цифровой нити, связывающей все этапы [9].</w:t>
+        <w:t>правление производственной системой должно учитывать не только текущее состояние, но и траекторию развития, закладывая в управленческие решения элемент прогнозирования.</w:t>
+      </w:r>
+    </w:p>
+    <w:p>
+      <w:r>
+        <w:t>Информационная насыщенность. В современном производстве доля информационного компонента в стоимости продукции неуклонно растёт. Управление предприятием сегодня — это в значительной мере управление данными: их сбором, верификацией, интерпретацией и превращением в решения. Е. И. Яблочников и соавторы обращают внимание на то, что информационные технологии пронизывают весь жизненный цикл изделия — от концепции и проектирования до производства, эксплуатации и утилизации, — и управление предприятием невозможно без сквозной цифровой нити, связывающей все этапы.</w:t>
       </w:r>
     </w:p>
     <w:p>
@@ -979,7 +997,13 @@
     </w:p>
     <w:p>
       <w:r>
-        <w:t>Автоматизированная система управления предприятием (АСУП) представляет собой комплекс программных, технических, информационных, организационных и кадровых средств, предназначенный для автоматизации управленческих функций на уровне предприятия как хозяйствующего субъекта. В отличие от АСУ ТП, воздействующей непосредственно на технологические параметры, АСУП оперирует экономическими, плановыми и организационными данными и обеспечивает принятие решений руководителями различных уровней [4].</w:t>
+        <w:t xml:space="preserve">Автоматизированная система управления предприятием (АСУП) представляет собой комплекс программных, технических, информационных, организационных и кадровых средств, предназначенный для автоматизации управленческих функций на уровне предприятия как хозяйствующего субъекта. В отличие от АСУ ТП, воздействующей непосредственно на технологические параметры, АСУП оперирует экономическими, плановыми и организационными данными и обеспечивает принятие решений руководителями различных уровней </w:t>
+      </w:r>
+      <w:r>
+        <w:t>[3]</w:t>
+      </w:r>
+      <w:r>
+        <w:t>.</w:t>
       </w:r>
     </w:p>
     <w:p>
@@ -1013,7 +1037,13 @@
         <w:t>К</w:t>
       </w:r>
       <w:r>
-        <w:t>ачество информационного обеспечения является определяющим фактором эффективности АСУП: система, оперирующая неточными или несвоевременными данными, генерирует некорректные управленческие решения, что может быть опаснее отсутствия системы вообще [4].</w:t>
+        <w:t xml:space="preserve">ачество информационного обеспечения является определяющим фактором эффективности АСУП: система, оперирующая неточными или несвоевременными данными, генерирует некорректные управленческие решения, что может быть опаснее отсутствия системы вообще </w:t>
+      </w:r>
+      <w:r>
+        <w:t>[3]</w:t>
+      </w:r>
+      <w:r>
+        <w:t>.</w:t>
       </w:r>
     </w:p>
     <w:p>
@@ -1029,7 +1059,13 @@
         <w:t>Т</w:t>
       </w:r>
       <w:r>
-        <w:t>ехнология проектирования АСУП должна включать не только разработку программного и технического обеспечения, но и проектирование организационного обеспечения: новых должностных инструкций, регламентов взаимодействия подразделений, процедур принятия решений [4]. Без этой составляющей даже технически безупречная система не будет эффективно использоваться.</w:t>
+        <w:t xml:space="preserve">ехнология проектирования АСУП должна включать не только разработку программного и технического обеспечения, но и проектирование организационного обеспечения: новых должностных инструкций, регламентов взаимодействия подразделений, процедур принятия решений </w:t>
+      </w:r>
+      <w:r>
+        <w:t>[3]</w:t>
+      </w:r>
+      <w:r>
+        <w:t>. Без этой составляющей даже технически безупречная система не будет эффективно использоваться.</w:t>
       </w:r>
     </w:p>
     <w:p>
@@ -1119,7 +1155,13 @@
       </w:r>
       <w:r>
         <w:lastRenderedPageBreak/>
-        <w:t>непрерывные и дискретные участки [8]. По степени автоматизации различают автоматические системы (человек исключён из контура регулирования) и автоматизированные системы (человек-оператор участвует в принятии решений на верхнем уровне) [4].</w:t>
+        <w:t xml:space="preserve">непрерывные и дискретные участки. По степени автоматизации различают автоматические системы (человек исключён из контура регулирования) и автоматизированные системы (человек-оператор участвует в принятии решений на верхнем уровне) </w:t>
+      </w:r>
+      <w:r>
+        <w:t>[3]</w:t>
+      </w:r>
+      <w:r>
+        <w:t>.</w:t>
       </w:r>
     </w:p>
     <w:p>
@@ -1212,41 +1254,7 @@
         <w:rPr>
           <w:rFonts w:eastAsiaTheme="majorEastAsia"/>
         </w:rPr>
-        <w:t>Рудинский И. Д. Технология проектирования автоматизированных систем обработки информации и управления : учебное пособие для вузов. — М. : Горячая линия – Телеком, 2011. — 304 с.</w:t>
-      </w:r>
-    </w:p>
-    <w:p>
-      <w:pPr>
-        <w:numPr>
-          <w:ilvl w:val="0"/>
-          <w:numId w:val="8"/>
-        </w:numPr>
-        <w:rPr>
-          <w:rFonts w:eastAsiaTheme="majorEastAsia"/>
-        </w:rPr>
-      </w:pPr>
-      <w:r>
-        <w:rPr>
-          <w:rFonts w:eastAsiaTheme="majorEastAsia"/>
-        </w:rPr>
         <w:t>Теория систем и системный анализ в управлении организациями : справочник : учебное пособие / под ред. В. Н. Волковой и А. А. Емельянова. — М. : Финансы и статистика, 2006. — 848 с.</w:t>
-      </w:r>
-    </w:p>
-    <w:p>
-      <w:pPr>
-        <w:numPr>
-          <w:ilvl w:val="0"/>
-          <w:numId w:val="8"/>
-        </w:numPr>
-        <w:rPr>
-          <w:rFonts w:eastAsiaTheme="majorEastAsia"/>
-        </w:rPr>
-      </w:pPr>
-      <w:r>
-        <w:rPr>
-          <w:rFonts w:eastAsiaTheme="majorEastAsia"/>
-        </w:rPr>
-        <w:t>Псигин Ю. В. Управление производственными системами : учебно-методическое пособие. — Ульяновск : УлГТУ, 2019. — 180 с.</w:t>
       </w:r>
     </w:p>
     <w:p>

</xml_diff>